<commit_message>
added first iteration of AI checking functionality + centering of cube face on screen
</commit_message>
<xml_diff>
--- a/DOCUMENTATION/ECS Design including the Octagon as Control Device.docx
+++ b/DOCUMENTATION/ECS Design including the Octagon as Control Device.docx
@@ -112,7 +112,7 @@
     <w:p/>
     <w:p>
       <w:r>
-        <w:t xml:space="preserve">1. </w:t>
+        <w:t>1.</w:t>
       </w:r>
       <w:r>
         <w:t>a. Long</w:t>
@@ -140,7 +140,20 @@
         <w:t xml:space="preserve">textual or corpus dimension description of </w:t>
       </w:r>
       <w:r>
-        <w:t xml:space="preserve">how “how?” is being understood in this ECS (see visualization below); b: Long click takes the user to a </w:t>
+        <w:t>how “how?” is being understood in this ECS (see visualization below</w:t>
+      </w:r>
+      <w:proofErr w:type="gramStart"/>
+      <w:r>
+        <w:t>);</w:t>
+      </w:r>
+      <w:proofErr w:type="gramEnd"/>
+      <w:r>
+        <w:t xml:space="preserve"> </w:t>
+      </w:r>
+    </w:p>
+    <w:p>
+      <w:r>
+        <w:t xml:space="preserve">b: Long click takes the user to a </w:t>
       </w:r>
       <w:r>
         <w:rPr>
@@ -156,10 +169,37 @@
         <w:t xml:space="preserve"> (note that what is lockable would be these texts/corpuses—it might be possible via a different permission to make additions [but not edits to existing texts] at this level) </w:t>
       </w:r>
       <w:r>
-        <w:t>; c. double-click: function still to be determined.</w:t>
+        <w:t xml:space="preserve">; </w:t>
       </w:r>
     </w:p>
     <w:p>
+      <w:pPr>
+        <w:rPr>
+          <w:i/>
+          <w:iCs/>
+        </w:rPr>
+      </w:pPr>
+      <w:r>
+        <w:t xml:space="preserve">c. </w:t>
+      </w:r>
+      <w:proofErr w:type="gramStart"/>
+      <w:r>
+        <w:rPr>
+          <w:i/>
+          <w:iCs/>
+        </w:rPr>
+        <w:t>double-click:</w:t>
+      </w:r>
+      <w:proofErr w:type="gramEnd"/>
+      <w:r>
+        <w:rPr>
+          <w:i/>
+          <w:iCs/>
+        </w:rPr>
+        <w:t xml:space="preserve"> function still to be determined.</w:t>
+      </w:r>
+    </w:p>
+    <w:p>
       <w:r>
         <w:t xml:space="preserve">2. a. Brief click: causes to appear brief, </w:t>
       </w:r>
@@ -183,7 +223,20 @@
         <w:t xml:space="preserve"> </w:t>
       </w:r>
       <w:r>
-        <w:t xml:space="preserve">dimension) description of how “how?” is being understood in this ECS (see visualization below); b: Long click takes the user to a </w:t>
+        <w:t>dimension) description of how “how?” is being understood in this ECS (see visualization below</w:t>
+      </w:r>
+      <w:proofErr w:type="gramStart"/>
+      <w:r>
+        <w:t>);</w:t>
+      </w:r>
+      <w:proofErr w:type="gramEnd"/>
+      <w:r>
+        <w:t xml:space="preserve"> </w:t>
+      </w:r>
+    </w:p>
+    <w:p>
+      <w:r>
+        <w:t xml:space="preserve">b: Long click takes the user to a </w:t>
       </w:r>
       <w:r>
         <w:rPr>
@@ -211,10 +264,41 @@
         <w:t xml:space="preserve">  (note that what is lockable would be these texts/corpuses—it might be possible via a different permission to make additions [but not edits to existing texts] at this level)</w:t>
       </w:r>
       <w:r>
-        <w:t>; c. double-click: function still to be determined.</w:t>
+        <w:t>;</w:t>
       </w:r>
     </w:p>
     <w:p>
+      <w:pPr>
+        <w:rPr>
+          <w:i/>
+          <w:iCs/>
+        </w:rPr>
+      </w:pPr>
+      <w:r>
+        <w:rPr>
+          <w:i/>
+          <w:iCs/>
+        </w:rPr>
+        <w:t xml:space="preserve"> c. </w:t>
+      </w:r>
+      <w:proofErr w:type="gramStart"/>
+      <w:r>
+        <w:rPr>
+          <w:i/>
+          <w:iCs/>
+        </w:rPr>
+        <w:t>double-click:</w:t>
+      </w:r>
+      <w:proofErr w:type="gramEnd"/>
+      <w:r>
+        <w:rPr>
+          <w:i/>
+          <w:iCs/>
+        </w:rPr>
+        <w:t xml:space="preserve"> function still to be determined.</w:t>
+      </w:r>
+    </w:p>
+    <w:p>
       <w:r>
         <w:t>3. a. Brief click: causes latest edits to be saved</w:t>
       </w:r>
@@ -228,13 +312,34 @@
         <w:t xml:space="preserve"> log of all changes to the original ESC </w:t>
       </w:r>
       <w:r>
-        <w:t xml:space="preserve">(in this case how?-specific changes) </w:t>
-      </w:r>
-      <w:r>
-        <w:t>to be initiated</w:t>
-      </w:r>
-      <w:r>
-        <w:t xml:space="preserve">; b. long click makes available two </w:t>
+        <w:t xml:space="preserve">(in this case </w:t>
+      </w:r>
+      <w:proofErr w:type="gramStart"/>
+      <w:r>
+        <w:t>how?-</w:t>
+      </w:r>
+      <w:proofErr w:type="gramEnd"/>
+      <w:r>
+        <w:t xml:space="preserve">specific changes) </w:t>
+      </w:r>
+      <w:r>
+        <w:t xml:space="preserve">to be </w:t>
+      </w:r>
+      <w:proofErr w:type="gramStart"/>
+      <w:r>
+        <w:t>initiated</w:t>
+      </w:r>
+      <w:r>
+        <w:t>;</w:t>
+      </w:r>
+      <w:proofErr w:type="gramEnd"/>
+      <w:r>
+        <w:t xml:space="preserve"> </w:t>
+      </w:r>
+    </w:p>
+    <w:p>
+      <w:r>
+        <w:t xml:space="preserve">b. long click makes available two </w:t>
       </w:r>
       <w:r>
         <w:t xml:space="preserve">exportable </w:t>
@@ -274,88 +379,159 @@
         <w:t>“why” in this ECS is being defined as teleological</w:t>
       </w:r>
       <w:r>
-        <w:t>; c. double-click: function still to be determined.</w:t>
+        <w:t xml:space="preserve">; </w:t>
       </w:r>
     </w:p>
     <w:p>
-      <w:r>
-        <w:t xml:space="preserve">4. a. Brief click: clauses the ECS to be reset and again become turn-able or activatable via the activation button.  b. long click &amp; c. </w:t>
+      <w:pPr>
+        <w:rPr>
+          <w:i/>
+          <w:iCs/>
+        </w:rPr>
+      </w:pPr>
+      <w:r>
+        <w:rPr>
+          <w:i/>
+          <w:iCs/>
+        </w:rPr>
+        <w:t xml:space="preserve">c. </w:t>
       </w:r>
       <w:proofErr w:type="gramStart"/>
       <w:r>
-        <w:t>double</w:t>
-      </w:r>
-      <w:r>
-        <w:t>-</w:t>
-      </w:r>
-      <w:r>
-        <w:t>click:</w:t>
+        <w:rPr>
+          <w:i/>
+          <w:iCs/>
+        </w:rPr>
+        <w:t>double-click:</w:t>
       </w:r>
       <w:proofErr w:type="gramEnd"/>
       <w:r>
-        <w:t xml:space="preserve"> functions </w:t>
-      </w:r>
-      <w:r>
-        <w:t xml:space="preserve">yet </w:t>
-      </w:r>
-      <w:r>
-        <w:t>to be defined.</w:t>
+        <w:rPr>
+          <w:i/>
+          <w:iCs/>
+        </w:rPr>
+        <w:t xml:space="preserve"> function still to be determined.</w:t>
       </w:r>
     </w:p>
     <w:p>
       <w:r>
-        <w:t xml:space="preserve"> </w:t>
-      </w:r>
-      <w:r>
-        <w:t xml:space="preserve">II. </w:t>
-      </w:r>
-      <w:r>
-        <w:t>Editing Pages</w:t>
+        <w:t xml:space="preserve">4. a. Brief click: clauses the ECS to be reset and again become turn-able or activatable via the activation button. </w:t>
       </w:r>
     </w:p>
     <w:p>
-      <w:r>
-        <w:t xml:space="preserve">Below is the possible look for </w:t>
-      </w:r>
-      <w:r>
-        <w:t>the respective</w:t>
-      </w:r>
-      <w:r>
-        <w:t xml:space="preserve"> editing page</w:t>
-      </w:r>
-      <w:r>
-        <w:t>s</w:t>
-      </w:r>
-      <w:r>
-        <w:t xml:space="preserve">. In the above case of “How?”, the ECS consisting of octahedron and cube would remain in its place but faded out (like a watermark on a sheet of paper you can write on), and instead of the question “How?” you would </w:t>
-      </w:r>
-      <w:r>
-        <w:t xml:space="preserve">faintly </w:t>
-      </w:r>
-      <w:r>
-        <w:t xml:space="preserve">see its inverted </w:t>
-      </w:r>
-      <w:r>
-        <w:t xml:space="preserve">(cubic) </w:t>
-      </w:r>
-      <w:r>
-        <w:t>correspondent “Why?” on the “other</w:t>
-      </w:r>
-      <w:r>
-        <w:t>”</w:t>
-      </w:r>
-      <w:r>
-        <w:t xml:space="preserve"> side of the cube</w:t>
-      </w:r>
-      <w:r>
-        <w:t>.</w:t>
-      </w:r>
-      <w:r>
-        <w:t xml:space="preserve"> </w:t>
+      <w:pPr>
+        <w:rPr>
+          <w:i/>
+          <w:iCs/>
+        </w:rPr>
+      </w:pPr>
+      <w:r>
+        <w:rPr>
+          <w:i/>
+          <w:iCs/>
+        </w:rPr>
+        <w:t xml:space="preserve">b. long click &amp; c. </w:t>
+      </w:r>
+      <w:proofErr w:type="gramStart"/>
+      <w:r>
+        <w:rPr>
+          <w:i/>
+          <w:iCs/>
+        </w:rPr>
+        <w:t>double</w:t>
+      </w:r>
+      <w:r>
+        <w:rPr>
+          <w:i/>
+          <w:iCs/>
+        </w:rPr>
+        <w:t>-</w:t>
+      </w:r>
+      <w:r>
+        <w:rPr>
+          <w:i/>
+          <w:iCs/>
+        </w:rPr>
+        <w:t>click:</w:t>
+      </w:r>
+      <w:proofErr w:type="gramEnd"/>
+      <w:r>
+        <w:rPr>
+          <w:i/>
+          <w:iCs/>
+        </w:rPr>
+        <w:t xml:space="preserve"> functions </w:t>
+      </w:r>
+      <w:r>
+        <w:rPr>
+          <w:i/>
+          <w:iCs/>
+        </w:rPr>
+        <w:t xml:space="preserve">yet </w:t>
+      </w:r>
+      <w:r>
+        <w:rPr>
+          <w:i/>
+          <w:iCs/>
+        </w:rPr>
+        <w:t>to be defined.</w:t>
       </w:r>
     </w:p>
     <w:p>
       <w:r>
+        <w:t xml:space="preserve"> </w:t>
+      </w:r>
+      <w:r>
+        <w:t xml:space="preserve">II. </w:t>
+      </w:r>
+      <w:r>
+        <w:t>Editing Pages</w:t>
+      </w:r>
+    </w:p>
+    <w:p>
+      <w:r>
+        <w:t xml:space="preserve">Below is the possible look for </w:t>
+      </w:r>
+      <w:r>
+        <w:t>the respective</w:t>
+      </w:r>
+      <w:r>
+        <w:t xml:space="preserve"> editing page</w:t>
+      </w:r>
+      <w:r>
+        <w:t>s</w:t>
+      </w:r>
+      <w:r>
+        <w:t xml:space="preserve">. In the above case of “How?”, the ECS consisting of octahedron and cube would remain in its place but faded out (like a watermark on a sheet of paper you can write on), and instead of the question “How?” you would </w:t>
+      </w:r>
+      <w:r>
+        <w:t xml:space="preserve">faintly </w:t>
+      </w:r>
+      <w:r>
+        <w:t xml:space="preserve">see its inverted </w:t>
+      </w:r>
+      <w:r>
+        <w:t xml:space="preserve">(cubic) </w:t>
+      </w:r>
+      <w:r>
+        <w:t>correspondent “Why?” on the “other</w:t>
+      </w:r>
+      <w:r>
+        <w:t>”</w:t>
+      </w:r>
+      <w:r>
+        <w:t xml:space="preserve"> side of the cube</w:t>
+      </w:r>
+      <w:r>
+        <w:t>.</w:t>
+      </w:r>
+      <w:r>
+        <w:t xml:space="preserve"> </w:t>
+      </w:r>
+    </w:p>
+    <w:p>
+      <w:r>
+        <w:lastRenderedPageBreak/>
         <w:t xml:space="preserve">Editing for how? and why? would use the </w:t>
       </w:r>
       <w:r>
@@ -580,7 +756,7 @@
           </mc:Choice>
           <mc:Fallback>
             <w:pict>
-              <v:rect w14:anchorId="0AFC67D8" id="Rectangle 6" o:spid="_x0000_s1026" style="position:absolute;margin-left:-4.15pt;margin-top:10.9pt;width:477pt;height:501.9pt;z-index:251659264;visibility:visible;mso-wrap-style:square;mso-wrap-distance-left:9pt;mso-wrap-distance-top:0;mso-wrap-distance-right:9pt;mso-wrap-distance-bottom:0;mso-position-horizontal:absolute;mso-position-horizontal-relative:text;mso-position-vertical:absolute;mso-position-vertical-relative:text;v-text-anchor:middle" o:gfxdata="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" filled="f" strokecolor="#030e13 [484]" strokeweight="3pt"/>
+              <v:rect w14:anchorId="0AFC67D8" id="Rectangle 6" o:spid="_x0000_s1026" style="position:absolute;margin-left:-4.15pt;margin-top:10.9pt;width:477pt;height:501.9pt;z-index:251659264;visibility:visible;mso-wrap-style:square;mso-wrap-distance-left:9pt;mso-wrap-distance-top:0;mso-wrap-distance-right:9pt;mso-wrap-distance-bottom:0;mso-position-horizontal:absolute;mso-position-horizontal-relative:text;mso-position-vertical:absolute;mso-position-vertical-relative:text;v-text-anchor:middle" o:gfxdata="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" filled="f" strokecolor="#030e13 [484]" strokeweight="3pt"/>
             </w:pict>
           </mc:Fallback>
         </mc:AlternateContent>
@@ -839,6 +1015,7 @@
         </w:rPr>
       </w:pPr>
       <w:r>
+        <w:lastRenderedPageBreak/>
         <w:t xml:space="preserve">              </w:t>
       </w:r>
       <w:r>
@@ -1172,23 +1349,7 @@
                 <w:sz w:val="20"/>
                 <w:szCs w:val="20"/>
               </w:rPr>
-              <w:t xml:space="preserve">(The ECS is replaced here by the edit pages discussed above when </w:t>
-            </w:r>
-            <w:proofErr w:type="spellStart"/>
-            <w:r>
-              <w:rPr>
-                <w:sz w:val="20"/>
-                <w:szCs w:val="20"/>
-              </w:rPr>
-              <w:t>edting</w:t>
-            </w:r>
-            <w:proofErr w:type="spellEnd"/>
-            <w:r>
-              <w:rPr>
-                <w:sz w:val="20"/>
-                <w:szCs w:val="20"/>
-              </w:rPr>
-              <w:t>.)</w:t>
+              <w:t>(The ECS is replaced here by the edit pages discussed above when edting.)</w:t>
             </w:r>
           </w:p>
         </w:tc>
@@ -1456,6 +1617,7 @@
     </w:p>
     <w:p>
       <w:r>
+        <w:lastRenderedPageBreak/>
         <w:t xml:space="preserve">2. Horizontal consistency Gauge: Uses generative AI, via prompts set by managers/instructors, to </w:t>
       </w:r>
       <w:r>
@@ -1772,6 +1934,184 @@
     </w:lvl>
   </w:abstractNum>
   <w:abstractNum w:abstractNumId="3" w15:restartNumberingAfterBreak="0">
+    <w:nsid w:val="5E7C1063"/>
+    <w:multiLevelType w:val="hybridMultilevel"/>
+    <w:tmpl w:val="2EFE2112"/>
+    <w:lvl w:ilvl="0" w:tplc="0409000F">
+      <w:start w:val="1"/>
+      <w:numFmt w:val="decimal"/>
+      <w:lvlText w:val="%1."/>
+      <w:lvlJc w:val="left"/>
+      <w:pPr>
+        <w:ind w:left="720" w:hanging="360"/>
+      </w:pPr>
+      <w:rPr>
+        <w:rFonts w:hint="default"/>
+      </w:rPr>
+    </w:lvl>
+    <w:lvl w:ilvl="1" w:tplc="04090019" w:tentative="1">
+      <w:start w:val="1"/>
+      <w:numFmt w:val="lowerLetter"/>
+      <w:lvlText w:val="%2."/>
+      <w:lvlJc w:val="left"/>
+      <w:pPr>
+        <w:ind w:left="1440" w:hanging="360"/>
+      </w:pPr>
+    </w:lvl>
+    <w:lvl w:ilvl="2" w:tplc="0409001B" w:tentative="1">
+      <w:start w:val="1"/>
+      <w:numFmt w:val="lowerRoman"/>
+      <w:lvlText w:val="%3."/>
+      <w:lvlJc w:val="right"/>
+      <w:pPr>
+        <w:ind w:left="2160" w:hanging="180"/>
+      </w:pPr>
+    </w:lvl>
+    <w:lvl w:ilvl="3" w:tplc="0409000F" w:tentative="1">
+      <w:start w:val="1"/>
+      <w:numFmt w:val="decimal"/>
+      <w:lvlText w:val="%4."/>
+      <w:lvlJc w:val="left"/>
+      <w:pPr>
+        <w:ind w:left="2880" w:hanging="360"/>
+      </w:pPr>
+    </w:lvl>
+    <w:lvl w:ilvl="4" w:tplc="04090019" w:tentative="1">
+      <w:start w:val="1"/>
+      <w:numFmt w:val="lowerLetter"/>
+      <w:lvlText w:val="%5."/>
+      <w:lvlJc w:val="left"/>
+      <w:pPr>
+        <w:ind w:left="3600" w:hanging="360"/>
+      </w:pPr>
+    </w:lvl>
+    <w:lvl w:ilvl="5" w:tplc="0409001B" w:tentative="1">
+      <w:start w:val="1"/>
+      <w:numFmt w:val="lowerRoman"/>
+      <w:lvlText w:val="%6."/>
+      <w:lvlJc w:val="right"/>
+      <w:pPr>
+        <w:ind w:left="4320" w:hanging="180"/>
+      </w:pPr>
+    </w:lvl>
+    <w:lvl w:ilvl="6" w:tplc="0409000F" w:tentative="1">
+      <w:start w:val="1"/>
+      <w:numFmt w:val="decimal"/>
+      <w:lvlText w:val="%7."/>
+      <w:lvlJc w:val="left"/>
+      <w:pPr>
+        <w:ind w:left="5040" w:hanging="360"/>
+      </w:pPr>
+    </w:lvl>
+    <w:lvl w:ilvl="7" w:tplc="04090019" w:tentative="1">
+      <w:start w:val="1"/>
+      <w:numFmt w:val="lowerLetter"/>
+      <w:lvlText w:val="%8."/>
+      <w:lvlJc w:val="left"/>
+      <w:pPr>
+        <w:ind w:left="5760" w:hanging="360"/>
+      </w:pPr>
+    </w:lvl>
+    <w:lvl w:ilvl="8" w:tplc="0409001B" w:tentative="1">
+      <w:start w:val="1"/>
+      <w:numFmt w:val="lowerRoman"/>
+      <w:lvlText w:val="%9."/>
+      <w:lvlJc w:val="right"/>
+      <w:pPr>
+        <w:ind w:left="6480" w:hanging="180"/>
+      </w:pPr>
+    </w:lvl>
+  </w:abstractNum>
+  <w:abstractNum w:abstractNumId="4" w15:restartNumberingAfterBreak="0">
+    <w:nsid w:val="68E73129"/>
+    <w:multiLevelType w:val="hybridMultilevel"/>
+    <w:tmpl w:val="2D1A8D16"/>
+    <w:lvl w:ilvl="0" w:tplc="0409000F">
+      <w:start w:val="1"/>
+      <w:numFmt w:val="decimal"/>
+      <w:lvlText w:val="%1."/>
+      <w:lvlJc w:val="left"/>
+      <w:pPr>
+        <w:ind w:left="720" w:hanging="360"/>
+      </w:pPr>
+      <w:rPr>
+        <w:rFonts w:hint="default"/>
+      </w:rPr>
+    </w:lvl>
+    <w:lvl w:ilvl="1" w:tplc="04090019" w:tentative="1">
+      <w:start w:val="1"/>
+      <w:numFmt w:val="lowerLetter"/>
+      <w:lvlText w:val="%2."/>
+      <w:lvlJc w:val="left"/>
+      <w:pPr>
+        <w:ind w:left="1440" w:hanging="360"/>
+      </w:pPr>
+    </w:lvl>
+    <w:lvl w:ilvl="2" w:tplc="0409001B" w:tentative="1">
+      <w:start w:val="1"/>
+      <w:numFmt w:val="lowerRoman"/>
+      <w:lvlText w:val="%3."/>
+      <w:lvlJc w:val="right"/>
+      <w:pPr>
+        <w:ind w:left="2160" w:hanging="180"/>
+      </w:pPr>
+    </w:lvl>
+    <w:lvl w:ilvl="3" w:tplc="0409000F" w:tentative="1">
+      <w:start w:val="1"/>
+      <w:numFmt w:val="decimal"/>
+      <w:lvlText w:val="%4."/>
+      <w:lvlJc w:val="left"/>
+      <w:pPr>
+        <w:ind w:left="2880" w:hanging="360"/>
+      </w:pPr>
+    </w:lvl>
+    <w:lvl w:ilvl="4" w:tplc="04090019" w:tentative="1">
+      <w:start w:val="1"/>
+      <w:numFmt w:val="lowerLetter"/>
+      <w:lvlText w:val="%5."/>
+      <w:lvlJc w:val="left"/>
+      <w:pPr>
+        <w:ind w:left="3600" w:hanging="360"/>
+      </w:pPr>
+    </w:lvl>
+    <w:lvl w:ilvl="5" w:tplc="0409001B" w:tentative="1">
+      <w:start w:val="1"/>
+      <w:numFmt w:val="lowerRoman"/>
+      <w:lvlText w:val="%6."/>
+      <w:lvlJc w:val="right"/>
+      <w:pPr>
+        <w:ind w:left="4320" w:hanging="180"/>
+      </w:pPr>
+    </w:lvl>
+    <w:lvl w:ilvl="6" w:tplc="0409000F" w:tentative="1">
+      <w:start w:val="1"/>
+      <w:numFmt w:val="decimal"/>
+      <w:lvlText w:val="%7."/>
+      <w:lvlJc w:val="left"/>
+      <w:pPr>
+        <w:ind w:left="5040" w:hanging="360"/>
+      </w:pPr>
+    </w:lvl>
+    <w:lvl w:ilvl="7" w:tplc="04090019" w:tentative="1">
+      <w:start w:val="1"/>
+      <w:numFmt w:val="lowerLetter"/>
+      <w:lvlText w:val="%8."/>
+      <w:lvlJc w:val="left"/>
+      <w:pPr>
+        <w:ind w:left="5760" w:hanging="360"/>
+      </w:pPr>
+    </w:lvl>
+    <w:lvl w:ilvl="8" w:tplc="0409001B" w:tentative="1">
+      <w:start w:val="1"/>
+      <w:numFmt w:val="lowerRoman"/>
+      <w:lvlText w:val="%9."/>
+      <w:lvlJc w:val="right"/>
+      <w:pPr>
+        <w:ind w:left="6480" w:hanging="180"/>
+      </w:pPr>
+    </w:lvl>
+  </w:abstractNum>
+  <w:abstractNum w:abstractNumId="5" w15:restartNumberingAfterBreak="0">
     <w:nsid w:val="6DF47C37"/>
     <w:multiLevelType w:val="hybridMultilevel"/>
     <w:tmpl w:val="9E84B5C8"/>
@@ -1867,10 +2207,16 @@
     <w:abstractNumId w:val="0"/>
   </w:num>
   <w:num w:numId="3" w16cid:durableId="1897204284">
-    <w:abstractNumId w:val="3"/>
+    <w:abstractNumId w:val="5"/>
   </w:num>
   <w:num w:numId="4" w16cid:durableId="751656719">
     <w:abstractNumId w:val="1"/>
+  </w:num>
+  <w:num w:numId="5" w16cid:durableId="2041079625">
+    <w:abstractNumId w:val="3"/>
+  </w:num>
+  <w:num w:numId="6" w16cid:durableId="1747536881">
+    <w:abstractNumId w:val="4"/>
   </w:num>
 </w:numbering>
 </file>

</xml_diff>